<commit_message>
doc: rewrite manifesto — compact English brief
Replaces the 4-page Turkish-poetic version with a 2-page functional
brief. Sections: overview, data inventory, annotation table (data →
source → applied as → expresses), decision notes (one bullet per
mapping with the actual numeric ranges), structure + stack, control
table, repo link with content map. Calm tone, no manifesto theatrics.
</commit_message>
<xml_diff>
--- a/innerprint_manifesto.docx
+++ b/innerprint_manifesto.docx
@@ -4,35 +4,20 @@
   <w:body>
     <w:p>
       <w:pPr>
-        <w:jc w:val="center"/>
+        <w:jc w:val="left"/>
       </w:pPr>
       <w:r>
         <w:rPr>
           <w:rFonts w:ascii="Iowan Old Style" w:hAnsi="Iowan Old Style"/>
-          <w:b w:val="0"/>
           <w:color w:val="14101A"/>
-          <w:sz w:val="76"/>
+          <w:sz w:val="44"/>
         </w:rPr>
-        <w:t>innerprint</w:t>
+        <w:t>innerprint — the spiral within</w:t>
       </w:r>
     </w:p>
     <w:p>
       <w:pPr>
-        <w:jc w:val="center"/>
-      </w:pPr>
-      <w:r>
-        <w:rPr>
-          <w:rFonts w:ascii="Iowan Old Style" w:hAnsi="Iowan Old Style"/>
-          <w:i/>
-          <w:color w:val="3A2240"/>
-          <w:sz w:val="30"/>
-        </w:rPr>
-        <w:t>— the spiral within —</w:t>
-      </w:r>
-    </w:p>
-    <w:p>
-      <w:pPr>
-        <w:jc w:val="center"/>
+        <w:spacing w:after="200"/>
       </w:pPr>
       <w:r>
         <w:rPr>
@@ -43,7 +28,6 @@
         <w:t>Şeymanur Küçük  ·  2026  ·  data art installation</w:t>
       </w:r>
     </w:p>
-    <w:p/>
     <w:p>
       <w:pPr>
         <w:pStyle w:val="Heading1"/>
@@ -52,75 +36,21 @@
         <w:rPr>
           <w:rFonts w:ascii="Iowan Old Style" w:hAnsi="Iowan Old Style"/>
           <w:color w:val="14101A"/>
-          <w:sz w:val="32"/>
+          <w:sz w:val="26"/>
         </w:rPr>
-        <w:t>Manifesto</w:t>
+        <w:t>Overview</w:t>
       </w:r>
     </w:p>
     <w:p>
       <w:pPr>
-        <w:spacing w:before="80" w:after="80"/>
-        <w:ind w:left="567"/>
+        <w:spacing w:after="80"/>
       </w:pPr>
       <w:r>
         <w:rPr>
           <w:rFonts w:ascii="Iowan Old Style" w:hAnsi="Iowan Old Style"/>
-          <w:i/>
-          <w:color w:val="3A2240"/>
-          <w:sz w:val="24"/>
+          <w:sz w:val="21"/>
         </w:rPr>
-        <w:t>Bu bir gösterge paneli değil. İçinde yürünebilecek bir mekân.</w:t>
-      </w:r>
-    </w:p>
-    <w:p>
-      <w:pPr>
-        <w:spacing w:after="120"/>
-      </w:pPr>
-      <w:r>
-        <w:rPr>
-          <w:rFonts w:ascii="Iowan Old Style" w:hAnsi="Iowan Old Style"/>
-          <w:sz w:val="22"/>
-        </w:rPr>
-        <w:t>innerprint, sekiz aylık bir hayatın izlerini — dinlenen müziği, atılan adımları, İstanbul'un gökyüzünü, telefona harcanan saatleri — gerçek bir parmak izinin spiral desenine dönüştürür. Tek bir giriş, tek bir çıkış. Merkez bugündür; dış kenar 2025 Ağustos'unda başlar.</w:t>
-      </w:r>
-    </w:p>
-    <w:p>
-      <w:pPr>
-        <w:spacing w:after="120"/>
-      </w:pPr>
-      <w:r>
-        <w:rPr>
-          <w:rFonts w:ascii="Iowan Old Style" w:hAnsi="Iowan Old Style"/>
-          <w:sz w:val="22"/>
-        </w:rPr>
-        <w:t>Her parmak izi tek ve tekrar edilemez. Hayatın her sekiz ayı da öyle. Spiralin kıvrımları sıradan bir Arşimet eğrisi değildir; organik ufak salınımlarla biraz parmak izi, biraz nehir yatağı, biraz bir günün anısı olur. Yürüdükçe duvarın altında o günün müziği ısınır, üstünde o günün gökyüzü değişir, koridor o günün ekran süresine göre genişler ya da sıkıştırır. Ayağının altındaki ışık o gün ne kadar adım atıldığını söyler.</w:t>
-      </w:r>
-    </w:p>
-    <w:p>
-      <w:pPr>
-        <w:spacing w:after="120"/>
-      </w:pPr>
-      <w:r>
-        <w:rPr>
-          <w:rFonts w:ascii="Iowan Old Style" w:hAnsi="Iowan Old Style"/>
-          <w:sz w:val="22"/>
-        </w:rPr>
-        <w:t>Sakin günler nefes alır. Sıkışmış günler donar, kararır, ara sıra siyah parıltılarla ürperir. Eser duvarlardan veri akıtmaz — veriyi mekânlaştırır.</w:t>
-      </w:r>
-    </w:p>
-    <w:p>
-      <w:pPr>
-        <w:spacing w:before="80" w:after="80"/>
-        <w:ind w:left="567"/>
-      </w:pPr>
-      <w:r>
-        <w:rPr>
-          <w:rFonts w:ascii="Iowan Old Style" w:hAnsi="Iowan Old Style"/>
-          <w:i/>
-          <w:color w:val="3A2240"/>
-          <w:sz w:val="24"/>
-        </w:rPr>
-        <w:t>Veriyi görselleştirmiyoruz; üzerinde yürünebilir hale getiriyoruz.</w:t>
+        <w:t>266 days of personal data — Spotify listening, Istanbul weather, Apple Health steps, iOS Screen Time — rendered as a walkable fingerprint spiral. One entry on the outer edge, one path to the centre. Each day is one segment of the wall. Time runs from outside (2025-08-26) inward to the centre (today). Aesthetic reference: Damon Xart's gradient corridors.</w:t>
       </w:r>
     </w:p>
     <w:p>
@@ -131,50 +61,61 @@
         <w:rPr>
           <w:rFonts w:ascii="Iowan Old Style" w:hAnsi="Iowan Old Style"/>
           <w:color w:val="14101A"/>
-          <w:sz w:val="32"/>
+          <w:sz w:val="26"/>
         </w:rPr>
-        <w:t>Kavramsal Çerçeve</w:t>
+        <w:t>Data inventory (2025-08-26 → 2026-05-18, 266 days)</w:t>
       </w:r>
     </w:p>
     <w:p>
       <w:pPr>
-        <w:spacing w:after="120"/>
+        <w:pStyle w:val="ListBullet"/>
+        <w:spacing w:after="40"/>
       </w:pPr>
       <w:r>
         <w:rPr>
           <w:rFonts w:ascii="Iowan Old Style" w:hAnsi="Iowan Old Style"/>
-          <w:sz w:val="22"/>
+          <w:sz w:val="20"/>
         </w:rPr>
-        <w:t>Form, biyometrik bir parmak izinden ödünç alındı: tek girişli, merkezde sonlanan, organik salınımlı bir spiral. Her insan parmak izi kendine özgüdür; her insanın da bir dönemine ait verisi öyle. Form bu eşsizliği taşır.</w:t>
+        <w:t>Spotify — 16,874 streams in window; daily aggregates + per-day top track and its album.</w:t>
       </w:r>
     </w:p>
     <w:p>
       <w:pPr>
-        <w:spacing w:after="120"/>
+        <w:pStyle w:val="ListBullet"/>
+        <w:spacing w:after="40"/>
       </w:pPr>
       <w:r>
         <w:rPr>
           <w:rFonts w:ascii="Iowan Old Style" w:hAnsi="Iowan Old Style"/>
-          <w:sz w:val="22"/>
+          <w:sz w:val="20"/>
         </w:rPr>
-        <w:t>Aesthetic referans olarak Tayvanlı dijital sanatçı Damon Xart'ın (Hsieh Chen Lin) "gradient corridor" çalışmaları benimsendi: sert sınırlar değil, nefes alan dikey gradyanlar; geometri üzerine dökülmüş donmuş ışık. Bu his hem heykel görünümünde (orbit modu) hem koridor içinde (walk modu) korunur.</w:t>
+        <w:t>Weather — Istanbul daily archive (temperature, rain, snow, sunshine) from Open-Meteo.</w:t>
       </w:r>
     </w:p>
     <w:p>
       <w:pPr>
-        <w:spacing w:after="120"/>
+        <w:pStyle w:val="ListBullet"/>
+        <w:spacing w:after="40"/>
       </w:pPr>
       <w:r>
         <w:rPr>
           <w:rFonts w:ascii="Iowan Old Style" w:hAnsi="Iowan Old Style"/>
-          <w:sz w:val="22"/>
+          <w:sz w:val="20"/>
         </w:rPr>
-        <w:t>Spiralin merkezi bugündür: "bugün" kelimesi merkez koordinatın kendisidir. Dışa doğru yürüdükçe geçmişe gidersin; içe doğru, yaşadığın güne yaklaşırsın. Bu yön kasıtlıdır: dışarısı tarih, merkez şimdidir.</w:t>
+        <w:t>Steps — daily totals from Apple Health export.</w:t>
       </w:r>
     </w:p>
     <w:p>
+      <w:pPr>
+        <w:pStyle w:val="ListBullet"/>
+        <w:spacing w:after="40"/>
+      </w:pPr>
       <w:r>
-        <w:br w:type="page"/>
+        <w:rPr>
+          <w:rFonts w:ascii="Iowan Old Style" w:hAnsi="Iowan Old Style"/>
+          <w:sz w:val="20"/>
+        </w:rPr>
+        <w:t>Screen Time — iOS Screen Time real values 2026-04-19 → 2026-05-18 (30 days), narrative mock for the earlier 236 days; provenance recorded in data/mock_metadata.json.</w:t>
       </w:r>
     </w:p>
     <w:p>
@@ -185,21 +126,21 @@
         <w:rPr>
           <w:rFonts w:ascii="Iowan Old Style" w:hAnsi="Iowan Old Style"/>
           <w:color w:val="14101A"/>
-          <w:sz w:val="32"/>
+          <w:sz w:val="26"/>
         </w:rPr>
-        <w:t>Veri Eşleme Tablosu</w:t>
+        <w:t>Data annotation</w:t>
       </w:r>
     </w:p>
     <w:p>
       <w:pPr>
-        <w:spacing w:after="120"/>
+        <w:spacing w:after="80"/>
       </w:pPr>
       <w:r>
         <w:rPr>
           <w:rFonts w:ascii="Iowan Old Style" w:hAnsi="Iowan Old Style"/>
-          <w:sz w:val="22"/>
+          <w:sz w:val="21"/>
         </w:rPr>
-        <w:t>Aşağıdaki tablo her veri akışının fiziksel/görsel karşılığını ve karar gerekçesini gösterir. 266 günün her biri için, bu kuralların kesişimi o günün duvarını üretir.</w:t>
+        <w:t>Each daily row produces one segment of the spiral. The wall is a vertical gradient between two anchors (bottom = album; top = sky). The corridor's shape, the floor's luminosity, and the heavy-screen darkening / glitch layer all key off other fields.</w:t>
       </w:r>
     </w:p>
     <w:tbl>
@@ -210,15 +151,15 @@
         <w:tblLook w:firstColumn="1" w:firstRow="1" w:lastColumn="0" w:lastRow="0" w:noHBand="0" w:noVBand="1" w:val="04A0"/>
       </w:tblPr>
       <w:tblGrid>
-        <w:gridCol w:w="2351"/>
-        <w:gridCol w:w="2351"/>
-        <w:gridCol w:w="2351"/>
-        <w:gridCol w:w="2351"/>
+        <w:gridCol w:w="2436"/>
+        <w:gridCol w:w="2436"/>
+        <w:gridCol w:w="2436"/>
+        <w:gridCol w:w="2436"/>
       </w:tblGrid>
       <w:tr>
         <w:tc>
           <w:tcPr>
-            <w:tcW w:type="dxa" w:w="2351"/>
+            <w:tcW w:type="dxa" w:w="2268"/>
             <w:shd w:val="clear" w:color="auto" w:fill="1A1020"/>
           </w:tcPr>
           <w:p>
@@ -231,15 +172,15 @@
                 <w:rFonts w:ascii="Iowan Old Style" w:hAnsi="Iowan Old Style"/>
                 <w:b/>
                 <w:color w:val="F5E9D8"/>
-                <w:sz w:val="18"/>
+                <w:sz w:val="17"/>
               </w:rPr>
-              <w:t>VERI</w:t>
+              <w:t>DATA</w:t>
             </w:r>
           </w:p>
         </w:tc>
         <w:tc>
           <w:tcPr>
-            <w:tcW w:type="dxa" w:w="2351"/>
+            <w:tcW w:type="dxa" w:w="2835"/>
             <w:shd w:val="clear" w:color="auto" w:fill="1A1020"/>
           </w:tcPr>
           <w:p>
@@ -252,15 +193,15 @@
                 <w:rFonts w:ascii="Iowan Old Style" w:hAnsi="Iowan Old Style"/>
                 <w:b/>
                 <w:color w:val="F5E9D8"/>
-                <w:sz w:val="18"/>
+                <w:sz w:val="17"/>
               </w:rPr>
-              <w:t>KAYNAK</w:t>
+              <w:t>SOURCE</w:t>
             </w:r>
           </w:p>
         </w:tc>
         <w:tc>
           <w:tcPr>
-            <w:tcW w:type="dxa" w:w="2351"/>
+            <w:tcW w:type="dxa" w:w="2268"/>
             <w:shd w:val="clear" w:color="auto" w:fill="1A1020"/>
           </w:tcPr>
           <w:p>
@@ -273,15 +214,15 @@
                 <w:rFonts w:ascii="Iowan Old Style" w:hAnsi="Iowan Old Style"/>
                 <w:b/>
                 <w:color w:val="F5E9D8"/>
-                <w:sz w:val="18"/>
+                <w:sz w:val="17"/>
               </w:rPr>
-              <w:t>GÖRSEL KARŞILIĞI</w:t>
+              <w:t>APPLIED AS</w:t>
             </w:r>
           </w:p>
         </w:tc>
         <w:tc>
           <w:tcPr>
-            <w:tcW w:type="dxa" w:w="2351"/>
+            <w:tcW w:type="dxa" w:w="2268"/>
             <w:shd w:val="clear" w:color="auto" w:fill="1A1020"/>
           </w:tcPr>
           <w:p>
@@ -294,9 +235,9 @@
                 <w:rFonts w:ascii="Iowan Old Style" w:hAnsi="Iowan Old Style"/>
                 <w:b/>
                 <w:color w:val="F5E9D8"/>
-                <w:sz w:val="18"/>
+                <w:sz w:val="17"/>
               </w:rPr>
-              <w:t>KARAR GEREKÇESI</w:t>
+              <w:t>EXPRESSES</w:t>
             </w:r>
           </w:p>
         </w:tc>
@@ -304,7 +245,7 @@
       <w:tr>
         <w:tc>
           <w:tcPr>
-            <w:tcW w:type="dxa" w:w="2351"/>
+            <w:tcW w:type="dxa" w:w="2268"/>
           </w:tcPr>
           <w:p>
             <w:pPr>
@@ -314,15 +255,15 @@
             <w:r>
               <w:rPr>
                 <w:rFonts w:ascii="Iowan Old Style" w:hAnsi="Iowan Old Style"/>
-                <w:sz w:val="20"/>
+                <w:sz w:val="18"/>
               </w:rPr>
-              <w:t>Spotify – günün en çok dinlenen şarkısının albümü</w:t>
+              <w:t>Top song's album signature colour</w:t>
             </w:r>
           </w:p>
         </w:tc>
         <w:tc>
           <w:tcPr>
-            <w:tcW w:type="dxa" w:w="2351"/>
+            <w:tcW w:type="dxa" w:w="2835"/>
           </w:tcPr>
           <w:p>
             <w:pPr>
@@ -332,15 +273,15 @@
             <w:r>
               <w:rPr>
                 <w:rFonts w:ascii="Iowan Old Style" w:hAnsi="Iowan Old Style"/>
-                <w:sz w:val="20"/>
+                <w:sz w:val="18"/>
               </w:rPr>
-              <w:t>spotify_history.csv → en yüksek play sayılı (artist, track) → albüm → signature renk</w:t>
+              <w:t>spotify_history.csv → most-played track of the day → album → curated hex</w:t>
             </w:r>
           </w:p>
         </w:tc>
         <w:tc>
           <w:tcPr>
-            <w:tcW w:type="dxa" w:w="2351"/>
+            <w:tcW w:type="dxa" w:w="2268"/>
           </w:tcPr>
           <w:p>
             <w:pPr>
@@ -350,15 +291,15 @@
             <w:r>
               <w:rPr>
                 <w:rFonts w:ascii="Iowan Old Style" w:hAnsi="Iowan Old Style"/>
-                <w:sz w:val="20"/>
+                <w:sz w:val="18"/>
               </w:rPr>
-              <w:t>Duvarın alt anchor rengi (gradyanın dibi)</w:t>
+              <w:t>Bottom anchor (warm)</w:t>
             </w:r>
           </w:p>
         </w:tc>
         <w:tc>
           <w:tcPr>
-            <w:tcW w:type="dxa" w:w="2351"/>
+            <w:tcW w:type="dxa" w:w="2268"/>
           </w:tcPr>
           <w:p>
             <w:pPr>
@@ -368,9 +309,9 @@
             <w:r>
               <w:rPr>
                 <w:rFonts w:ascii="Iowan Old Style" w:hAnsi="Iowan Old Style"/>
-                <w:sz w:val="20"/>
+                <w:sz w:val="18"/>
               </w:rPr>
-              <w:t>Müzik kişisel kimliktir; gün gün değişir. Albümün signature rengi 5 paralel AI ajan tarafından kapak görseline bakılarak seçildi — sayıca baskın değil, hatırlanan renk (Daft Punk altın, OK Computer buz-mavi, Strokes magenta).</w:t>
+              <w:t>The day's musical identity</w:t>
             </w:r>
           </w:p>
         </w:tc>
@@ -378,7 +319,7 @@
       <w:tr>
         <w:tc>
           <w:tcPr>
-            <w:tcW w:type="dxa" w:w="2351"/>
+            <w:tcW w:type="dxa" w:w="2268"/>
           </w:tcPr>
           <w:p>
             <w:pPr>
@@ -388,15 +329,15 @@
             <w:r>
               <w:rPr>
                 <w:rFonts w:ascii="Iowan Old Style" w:hAnsi="Iowan Old Style"/>
-                <w:sz w:val="20"/>
+                <w:sz w:val="18"/>
               </w:rPr>
-              <w:t>Hava (sıcaklık, güneş, yağış, kar)</w:t>
+              <w:t>Temperature, sun, rain, snow</w:t>
             </w:r>
           </w:p>
         </w:tc>
         <w:tc>
           <w:tcPr>
-            <w:tcW w:type="dxa" w:w="2351"/>
+            <w:tcW w:type="dxa" w:w="2835"/>
           </w:tcPr>
           <w:p>
             <w:pPr>
@@ -406,15 +347,15 @@
             <w:r>
               <w:rPr>
                 <w:rFonts w:ascii="Iowan Old Style" w:hAnsi="Iowan Old Style"/>
-                <w:sz w:val="20"/>
+                <w:sz w:val="18"/>
               </w:rPr>
-              <w:t>Open-Meteo Istanbul archive — 266 gün boyunca</w:t>
+              <w:t>Open-Meteo Istanbul archive</w:t>
             </w:r>
           </w:p>
         </w:tc>
         <w:tc>
           <w:tcPr>
-            <w:tcW w:type="dxa" w:w="2351"/>
+            <w:tcW w:type="dxa" w:w="2268"/>
           </w:tcPr>
           <w:p>
             <w:pPr>
@@ -424,15 +365,15 @@
             <w:r>
               <w:rPr>
                 <w:rFonts w:ascii="Iowan Old Style" w:hAnsi="Iowan Old Style"/>
-                <w:sz w:val="20"/>
+                <w:sz w:val="18"/>
               </w:rPr>
-              <w:t>Duvarın üst anchor rengi + tavan</w:t>
+              <w:t>Top anchor + ceiling</w:t>
             </w:r>
           </w:p>
         </w:tc>
         <w:tc>
           <w:tcPr>
-            <w:tcW w:type="dxa" w:w="2351"/>
+            <w:tcW w:type="dxa" w:w="2268"/>
           </w:tcPr>
           <w:p>
             <w:pPr>
@@ -442,9 +383,9 @@
             <w:r>
               <w:rPr>
                 <w:rFonts w:ascii="Iowan Old Style" w:hAnsi="Iowan Old Style"/>
-                <w:sz w:val="20"/>
+                <w:sz w:val="18"/>
               </w:rPr>
-              <w:t>Sıcak güneşli gün altın amber, soğuk güneşli gün gök mavisi, kapalı gün gri-mavi, yağmurlu gri, ağır yağmurlu siyaha yakın storm, karlı buz mavisi. RGB lerp ile yumuşak geçişler.</w:t>
+              <w:t>What the sky looked like</w:t>
             </w:r>
           </w:p>
         </w:tc>
@@ -452,7 +393,7 @@
       <w:tr>
         <w:tc>
           <w:tcPr>
-            <w:tcW w:type="dxa" w:w="2351"/>
+            <w:tcW w:type="dxa" w:w="2268"/>
           </w:tcPr>
           <w:p>
             <w:pPr>
@@ -462,7 +403,7 @@
             <w:r>
               <w:rPr>
                 <w:rFonts w:ascii="Iowan Old Style" w:hAnsi="Iowan Old Style"/>
-                <w:sz w:val="20"/>
+                <w:sz w:val="18"/>
               </w:rPr>
               <w:t>Sunshine hours</w:t>
             </w:r>
@@ -470,7 +411,7 @@
         </w:tc>
         <w:tc>
           <w:tcPr>
-            <w:tcW w:type="dxa" w:w="2351"/>
+            <w:tcW w:type="dxa" w:w="2835"/>
           </w:tcPr>
           <w:p>
             <w:pPr>
@@ -480,7 +421,7 @@
             <w:r>
               <w:rPr>
                 <w:rFonts w:ascii="Iowan Old Style" w:hAnsi="Iowan Old Style"/>
-                <w:sz w:val="20"/>
+                <w:sz w:val="18"/>
               </w:rPr>
               <w:t>Open-Meteo</w:t>
             </w:r>
@@ -488,7 +429,7 @@
         </w:tc>
         <w:tc>
           <w:tcPr>
-            <w:tcW w:type="dxa" w:w="2351"/>
+            <w:tcW w:type="dxa" w:w="2268"/>
           </w:tcPr>
           <w:p>
             <w:pPr>
@@ -498,15 +439,15 @@
             <w:r>
               <w:rPr>
                 <w:rFonts w:ascii="Iowan Old Style" w:hAnsi="Iowan Old Style"/>
-                <w:sz w:val="20"/>
+                <w:sz w:val="18"/>
               </w:rPr>
-              <w:t>Üst anchor parlaklığı</w:t>
+              <w:t>Top anchor brightness</w:t>
             </w:r>
           </w:p>
         </w:tc>
         <w:tc>
           <w:tcPr>
-            <w:tcW w:type="dxa" w:w="2351"/>
+            <w:tcW w:type="dxa" w:w="2268"/>
           </w:tcPr>
           <w:p>
             <w:pPr>
@@ -516,9 +457,9 @@
             <w:r>
               <w:rPr>
                 <w:rFonts w:ascii="Iowan Old Style" w:hAnsi="Iowan Old Style"/>
-                <w:sz w:val="20"/>
+                <w:sz w:val="18"/>
               </w:rPr>
-              <w:t>Çok güneşli → tavan dolu ışık, az güneşli → mat. Smoothstep gating ile geçiş ne kadar açık olduğunu duvarın üstünde okutur.</w:t>
+              <w:t>How much light reached the corridor</w:t>
             </w:r>
           </w:p>
         </w:tc>
@@ -526,7 +467,7 @@
       <w:tr>
         <w:tc>
           <w:tcPr>
-            <w:tcW w:type="dxa" w:w="2351"/>
+            <w:tcW w:type="dxa" w:w="2268"/>
           </w:tcPr>
           <w:p>
             <w:pPr>
@@ -536,15 +477,15 @@
             <w:r>
               <w:rPr>
                 <w:rFonts w:ascii="Iowan Old Style" w:hAnsi="Iowan Old Style"/>
-                <w:sz w:val="20"/>
+                <w:sz w:val="18"/>
               </w:rPr>
-              <w:t>Ekran süresi (toplam)</w:t>
+              <w:t>Screen time, total minutes</w:t>
             </w:r>
           </w:p>
         </w:tc>
         <w:tc>
           <w:tcPr>
-            <w:tcW w:type="dxa" w:w="2351"/>
+            <w:tcW w:type="dxa" w:w="2835"/>
           </w:tcPr>
           <w:p>
             <w:pPr>
@@ -554,15 +495,15 @@
             <w:r>
               <w:rPr>
                 <w:rFonts w:ascii="Iowan Old Style" w:hAnsi="Iowan Old Style"/>
-                <w:sz w:val="20"/>
+                <w:sz w:val="18"/>
               </w:rPr>
-              <w:t>iOS Screen Time (2026-04-13 → 2026-05-18 gerçek + öncesi 8-aylık narratif mock)</w:t>
+              <w:t>iOS Screen Time + mock for prior months</w:t>
             </w:r>
           </w:p>
         </w:tc>
         <w:tc>
           <w:tcPr>
-            <w:tcW w:type="dxa" w:w="2351"/>
+            <w:tcW w:type="dxa" w:w="2268"/>
           </w:tcPr>
           <w:p>
             <w:pPr>
@@ -572,15 +513,15 @@
             <w:r>
               <w:rPr>
                 <w:rFonts w:ascii="Iowan Old Style" w:hAnsi="Iowan Old Style"/>
-                <w:sz w:val="20"/>
+                <w:sz w:val="18"/>
               </w:rPr>
-              <w:t>Koridor genişliği + duvar yüksekliği + karanlıklaşma + glitch + siyah parlamalar</w:t>
+              <w:t>Corridor width + wall height + darkening + glitch</w:t>
             </w:r>
           </w:p>
         </w:tc>
         <w:tc>
           <w:tcPr>
-            <w:tcW w:type="dxa" w:w="2351"/>
+            <w:tcW w:type="dxa" w:w="2268"/>
           </w:tcPr>
           <w:p>
             <w:pPr>
@@ -590,9 +531,9 @@
             <w:r>
               <w:rPr>
                 <w:rFonts w:ascii="Iowan Old Style" w:hAnsi="Iowan Old Style"/>
-                <w:sz w:val="20"/>
+                <w:sz w:val="18"/>
               </w:rPr>
-              <w:t>Yoğun gün dar (0.92 m) + yüksek (4.9 m) + −%44 karanlık + ±%32 jitter; sakin gün ferah (3.20 m), kısa (2.8 m), nefes alan. Ekran süresi tek başına dört kanalı tetikler — bedensel sıkışma + atmosferik kararma.</w:t>
+              <w:t>Pressure and agitation from devices</w:t>
             </w:r>
           </w:p>
         </w:tc>
@@ -600,7 +541,7 @@
       <w:tr>
         <w:tc>
           <w:tcPr>
-            <w:tcW w:type="dxa" w:w="2351"/>
+            <w:tcW w:type="dxa" w:w="2268"/>
           </w:tcPr>
           <w:p>
             <w:pPr>
@@ -610,15 +551,15 @@
             <w:r>
               <w:rPr>
                 <w:rFonts w:ascii="Iowan Old Style" w:hAnsi="Iowan Old Style"/>
-                <w:sz w:val="20"/>
+                <w:sz w:val="18"/>
               </w:rPr>
-              <w:t>Ekran süresi alt kategorileri (productivity / social / entertainment / other)</w:t>
+              <w:t>Screen time, sub-categories</w:t>
             </w:r>
           </w:p>
         </w:tc>
         <w:tc>
           <w:tcPr>
-            <w:tcW w:type="dxa" w:w="2351"/>
+            <w:tcW w:type="dxa" w:w="2835"/>
           </w:tcPr>
           <w:p>
             <w:pPr>
@@ -628,15 +569,15 @@
             <w:r>
               <w:rPr>
                 <w:rFonts w:ascii="Iowan Old Style" w:hAnsi="Iowan Old Style"/>
-                <w:sz w:val="20"/>
+                <w:sz w:val="18"/>
               </w:rPr>
-              <w:t>iOS Screen Time</w:t>
+              <w:t>iOS Screen Time (productivity / social / entertainment / other)</w:t>
             </w:r>
           </w:p>
         </w:tc>
         <w:tc>
           <w:tcPr>
-            <w:tcW w:type="dxa" w:w="2351"/>
+            <w:tcW w:type="dxa" w:w="2268"/>
           </w:tcPr>
           <w:p>
             <w:pPr>
@@ -646,15 +587,15 @@
             <w:r>
               <w:rPr>
                 <w:rFonts w:ascii="Iowan Old Style" w:hAnsi="Iowan Old Style"/>
-                <w:sz w:val="20"/>
+                <w:sz w:val="18"/>
               </w:rPr>
-              <w:t>HUD'da sol üstte mini bar chart</w:t>
+              <w:t>HUD bar chart (top-left)</w:t>
             </w:r>
           </w:p>
         </w:tc>
         <w:tc>
           <w:tcPr>
-            <w:tcW w:type="dxa" w:w="2351"/>
+            <w:tcW w:type="dxa" w:w="2268"/>
           </w:tcPr>
           <w:p>
             <w:pPr>
@@ -664,9 +605,9 @@
             <w:r>
               <w:rPr>
                 <w:rFonts w:ascii="Iowan Old Style" w:hAnsi="Iowan Old Style"/>
-                <w:sz w:val="20"/>
+                <w:sz w:val="18"/>
               </w:rPr>
-              <w:t>Görsel olarak duvara binmez; bilgi katmanı olarak walking esnasında okunur. Her günün dakikalık dağılımı renkli bar olarak görünür (mavi: prod, pembe: social, amber: ent, gri: other).</w:t>
+              <w:t>How the day's screen time was spent</w:t>
             </w:r>
           </w:p>
         </w:tc>
@@ -674,7 +615,7 @@
       <w:tr>
         <w:tc>
           <w:tcPr>
-            <w:tcW w:type="dxa" w:w="2351"/>
+            <w:tcW w:type="dxa" w:w="2268"/>
           </w:tcPr>
           <w:p>
             <w:pPr>
@@ -684,15 +625,15 @@
             <w:r>
               <w:rPr>
                 <w:rFonts w:ascii="Iowan Old Style" w:hAnsi="Iowan Old Style"/>
-                <w:sz w:val="20"/>
+                <w:sz w:val="18"/>
               </w:rPr>
-              <w:t>Adım sayısı</w:t>
+              <w:t>Daily steps</w:t>
             </w:r>
           </w:p>
         </w:tc>
         <w:tc>
           <w:tcPr>
-            <w:tcW w:type="dxa" w:w="2351"/>
+            <w:tcW w:type="dxa" w:w="2835"/>
           </w:tcPr>
           <w:p>
             <w:pPr>
@@ -702,7 +643,7 @@
             <w:r>
               <w:rPr>
                 <w:rFonts w:ascii="Iowan Old Style" w:hAnsi="Iowan Old Style"/>
-                <w:sz w:val="20"/>
+                <w:sz w:val="18"/>
               </w:rPr>
               <w:t>Apple Health export</w:t>
             </w:r>
@@ -710,7 +651,7 @@
         </w:tc>
         <w:tc>
           <w:tcPr>
-            <w:tcW w:type="dxa" w:w="2351"/>
+            <w:tcW w:type="dxa" w:w="2268"/>
           </w:tcPr>
           <w:p>
             <w:pPr>
@@ -720,15 +661,15 @@
             <w:r>
               <w:rPr>
                 <w:rFonts w:ascii="Iowan Old Style" w:hAnsi="Iowan Old Style"/>
-                <w:sz w:val="20"/>
+                <w:sz w:val="18"/>
               </w:rPr>
-              <w:t>Zemindeki albüm rengi parlaklığı + koridor genişliğine ±%10 ek modülasyon</w:t>
+              <w:t>Floor luminosity + ±10% corridor width</w:t>
             </w:r>
           </w:p>
         </w:tc>
         <w:tc>
           <w:tcPr>
-            <w:tcW w:type="dxa" w:w="2351"/>
+            <w:tcW w:type="dxa" w:w="2268"/>
           </w:tcPr>
           <w:p>
             <w:pPr>
@@ -738,9 +679,9 @@
             <w:r>
               <w:rPr>
                 <w:rFonts w:ascii="Iowan Old Style" w:hAnsi="Iowan Old Style"/>
-                <w:sz w:val="20"/>
+                <w:sz w:val="18"/>
               </w:rPr>
-              <w:t>Çok yürünen gün → yerde o günün albüm rengi ışık havuzu olarak parlar + koridor +%10 ferahlar (beden dünyada hareketliydi). Az yürünen gün → zemin neredeyse siyah + koridor −%10 sıkışır.</w:t>
+              <w:t>Bodily presence in the world</w:t>
             </w:r>
           </w:p>
         </w:tc>
@@ -748,7 +689,7 @@
       <w:tr>
         <w:tc>
           <w:tcPr>
-            <w:tcW w:type="dxa" w:w="2351"/>
+            <w:tcW w:type="dxa" w:w="2268"/>
           </w:tcPr>
           <w:p>
             <w:pPr>
@@ -758,15 +699,15 @@
             <w:r>
               <w:rPr>
                 <w:rFonts w:ascii="Iowan Old Style" w:hAnsi="Iowan Old Style"/>
-                <w:sz w:val="20"/>
+                <w:sz w:val="18"/>
               </w:rPr>
-              <w:t>Late-night streams (gece dinlemeleri)</w:t>
+              <w:t>Late-night streams</w:t>
             </w:r>
           </w:p>
         </w:tc>
         <w:tc>
           <w:tcPr>
-            <w:tcW w:type="dxa" w:w="2351"/>
+            <w:tcW w:type="dxa" w:w="2835"/>
           </w:tcPr>
           <w:p>
             <w:pPr>
@@ -776,15 +717,15 @@
             <w:r>
               <w:rPr>
                 <w:rFonts w:ascii="Iowan Old Style" w:hAnsi="Iowan Old Style"/>
-                <w:sz w:val="20"/>
+                <w:sz w:val="18"/>
               </w:rPr>
-              <w:t>spotify_history.csv saat bazlı</w:t>
+              <w:t>spotify_history.csv (hour of day)</w:t>
             </w:r>
           </w:p>
         </w:tc>
         <w:tc>
           <w:tcPr>
-            <w:tcW w:type="dxa" w:w="2351"/>
+            <w:tcW w:type="dxa" w:w="2268"/>
           </w:tcPr>
           <w:p>
             <w:pPr>
@@ -794,15 +735,15 @@
             <w:r>
               <w:rPr>
                 <w:rFonts w:ascii="Iowan Old Style" w:hAnsi="Iowan Old Style"/>
-                <w:sz w:val="20"/>
+                <w:sz w:val="18"/>
               </w:rPr>
-              <w:t>(Şu an aktif değil — sonraki iterasyonda tavan karanlık derinliği)</w:t>
+              <w:t>Reserved — ceiling darkness, next iteration</w:t>
             </w:r>
           </w:p>
         </w:tc>
         <w:tc>
           <w:tcPr>
-            <w:tcW w:type="dxa" w:w="2351"/>
+            <w:tcW w:type="dxa" w:w="2268"/>
           </w:tcPr>
           <w:p>
             <w:pPr>
@@ -812,423 +753,9 @@
             <w:r>
               <w:rPr>
                 <w:rFonts w:ascii="Iowan Old Style" w:hAnsi="Iowan Old Style"/>
-                <w:sz w:val="20"/>
-              </w:rPr>
-              <w:t>Gece dinlemeleri tavanı koyulaştıracak: "gece çalışılmış gün" tavandan da hissedilir. Sonraki sprintin parçası.</w:t>
-            </w:r>
-          </w:p>
-        </w:tc>
-      </w:tr>
-    </w:tbl>
-    <w:p>
-      <w:pPr>
-        <w:pStyle w:val="Heading2"/>
-      </w:pPr>
-      <w:r>
-        <w:rPr>
-          <w:rFonts w:ascii="Iowan Old Style" w:hAnsi="Iowan Old Style"/>
-          <w:color w:val="14101A"/>
-          <w:sz w:val="26"/>
-        </w:rPr>
-        <w:t>Mock Veri Politikası</w:t>
-      </w:r>
-    </w:p>
-    <w:p>
-      <w:pPr>
-        <w:spacing w:after="120"/>
-      </w:pPr>
-      <w:r>
-        <w:rPr>
-          <w:rFonts w:ascii="Iowan Old Style" w:hAnsi="Iowan Old Style"/>
-          <w:sz w:val="22"/>
-        </w:rPr>
-        <w:t>iOS Screen Time, takip cihazına 2026-04-13 tarihinde ilk kez eklendiğinden, öncesi 7.5 ay için gerçek veri mevcut değildi. Boş bırakmak yerine deliberate bir narratif mock üretildi: Ağustos başlangıçtan Aralık başına kadar yüksek plato (final yıl projesi yoğunluğu), Aralık-Şubat arası vadi (yarıyıl tatili, Ocak dipi), Mart-Nisan rampası (yeniden ısınma). Mock günler sanat eserine eşit ağırlıkta katılır — provenance ayrımı `data/mock_metadata.json`'da tutulur, izleyiciye gösterilmez.</w:t>
-      </w:r>
-    </w:p>
-    <w:p>
-      <w:r>
-        <w:br w:type="page"/>
-      </w:r>
-    </w:p>
-    <w:p>
-      <w:pPr>
-        <w:pStyle w:val="Heading1"/>
-      </w:pPr>
-      <w:r>
-        <w:rPr>
-          <w:rFonts w:ascii="Iowan Old Style" w:hAnsi="Iowan Old Style"/>
-          <w:color w:val="14101A"/>
-          <w:sz w:val="32"/>
-        </w:rPr>
-        <w:t>Yapı ve Mekanik</w:t>
-      </w:r>
-    </w:p>
-    <w:p>
-      <w:pPr>
-        <w:spacing w:after="120"/>
-      </w:pPr>
-      <w:r>
-        <w:rPr>
-          <w:rFonts w:ascii="Iowan Old Style" w:hAnsi="Iowan Old Style"/>
-          <w:sz w:val="22"/>
-        </w:rPr>
-        <w:t>Spiral: 5 tur, dış yarıçap 18 m, iç yarıçap 2.5 m. Çift duvarlı koridor (2 m taban genişliği) + zemin + tavan. Walking modunda 1.62 m göz yüksekliği. Heykel modunda kamera yörüngede yavaşça döner.</w:t>
-      </w:r>
-    </w:p>
-    <w:p>
-      <w:pPr>
-        <w:spacing w:after="120"/>
-      </w:pPr>
-      <w:r>
-        <w:rPr>
-          <w:rFonts w:ascii="Iowan Old Style" w:hAnsi="Iowan Old Style"/>
-          <w:sz w:val="22"/>
-        </w:rPr>
-        <w:t>Her gün spiralin bir segmentini oluşturur; ardışık günler kesin kenarlarla değil yumuşak renk lerp'i ile birbirine bağlanır. Hiçbir veri sıçramasında sert sınır yoktur — komşu günler renk renge erir.</w:t>
-      </w:r>
-    </w:p>
-    <w:p>
-      <w:pPr>
-        <w:spacing w:after="120"/>
-      </w:pPr>
-      <w:r>
-        <w:rPr>
-          <w:rFonts w:ascii="Iowan Old Style" w:hAnsi="Iowan Old Style"/>
-          <w:sz w:val="22"/>
-        </w:rPr>
-        <w:t>Teknik altyapı: React 18 + react-three-fiber + Three.js + drei + postprocessing (bloom). Custom GLSL shader'lar her duvarı dikey gradyan + sakin günlerde nefes/akış + yoğun günlerde karanlık + glitch katmanı olarak çizer. Spotify Web Playback SDK (PKCE auth) yürüyüş esnasında o günün şarkısını çalar — varsayılan olarak audio-analysis ile nakarat bölümünden başlar.</w:t>
-      </w:r>
-    </w:p>
-    <w:p>
-      <w:pPr>
-        <w:pStyle w:val="Heading2"/>
-      </w:pPr>
-      <w:r>
-        <w:rPr>
-          <w:rFonts w:ascii="Iowan Old Style" w:hAnsi="Iowan Old Style"/>
-          <w:color w:val="14101A"/>
-          <w:sz w:val="26"/>
-        </w:rPr>
-        <w:t>Kontroller</w:t>
-      </w:r>
-    </w:p>
-    <w:tbl>
-      <w:tblPr>
-        <w:tblStyle w:val="LightGrid-Accent1"/>
-        <w:tblW w:type="auto" w:w="0"/>
-        <w:jc w:val="left"/>
-        <w:tblLook w:firstColumn="1" w:firstRow="1" w:lastColumn="0" w:lastRow="0" w:noHBand="0" w:noVBand="1" w:val="04A0"/>
-      </w:tblPr>
-      <w:tblGrid>
-        <w:gridCol w:w="4703"/>
-        <w:gridCol w:w="4703"/>
-      </w:tblGrid>
-      <w:tr>
-        <w:tc>
-          <w:tcPr>
-            <w:tcW w:type="dxa" w:w="4703"/>
-            <w:shd w:val="clear" w:color="auto" w:fill="1A1020"/>
-          </w:tcPr>
-          <w:p>
-            <w:pPr>
-              <w:spacing w:before="40" w:after="40"/>
-            </w:pPr>
-            <w:r/>
-            <w:r>
-              <w:rPr>
-                <w:rFonts w:ascii="Iowan Old Style" w:hAnsi="Iowan Old Style"/>
-                <w:b/>
-                <w:color w:val="F5E9D8"/>
                 <w:sz w:val="18"/>
               </w:rPr>
-              <w:t>TUŞ</w:t>
-            </w:r>
-          </w:p>
-        </w:tc>
-        <w:tc>
-          <w:tcPr>
-            <w:tcW w:type="dxa" w:w="4703"/>
-            <w:shd w:val="clear" w:color="auto" w:fill="1A1020"/>
-          </w:tcPr>
-          <w:p>
-            <w:pPr>
-              <w:spacing w:before="40" w:after="40"/>
-            </w:pPr>
-            <w:r/>
-            <w:r>
-              <w:rPr>
-                <w:rFonts w:ascii="Iowan Old Style" w:hAnsi="Iowan Old Style"/>
-                <w:b/>
-                <w:color w:val="F5E9D8"/>
-                <w:sz w:val="18"/>
-              </w:rPr>
-              <w:t>İŞLEV</w:t>
-            </w:r>
-          </w:p>
-        </w:tc>
-      </w:tr>
-      <w:tr>
-        <w:tc>
-          <w:tcPr>
-            <w:tcW w:type="dxa" w:w="4703"/>
-          </w:tcPr>
-          <w:p>
-            <w:pPr>
-              <w:spacing w:before="40" w:after="40"/>
-            </w:pPr>
-            <w:r/>
-            <w:r>
-              <w:rPr>
-                <w:rFonts w:ascii="Iowan Old Style" w:hAnsi="Iowan Old Style"/>
-                <w:sz w:val="20"/>
-              </w:rPr>
-              <w:t>V</w:t>
-            </w:r>
-          </w:p>
-        </w:tc>
-        <w:tc>
-          <w:tcPr>
-            <w:tcW w:type="dxa" w:w="4703"/>
-          </w:tcPr>
-          <w:p>
-            <w:pPr>
-              <w:spacing w:before="40" w:after="40"/>
-            </w:pPr>
-            <w:r/>
-            <w:r>
-              <w:rPr>
-                <w:rFonts w:ascii="Iowan Old Style" w:hAnsi="Iowan Old Style"/>
-                <w:sz w:val="20"/>
-              </w:rPr>
-              <w:t>orbit ↔ walk modunu değiştir</w:t>
-            </w:r>
-          </w:p>
-        </w:tc>
-      </w:tr>
-      <w:tr>
-        <w:tc>
-          <w:tcPr>
-            <w:tcW w:type="dxa" w:w="4703"/>
-          </w:tcPr>
-          <w:p>
-            <w:pPr>
-              <w:spacing w:before="40" w:after="40"/>
-            </w:pPr>
-            <w:r/>
-            <w:r>
-              <w:rPr>
-                <w:rFonts w:ascii="Iowan Old Style" w:hAnsi="Iowan Old Style"/>
-                <w:sz w:val="20"/>
-              </w:rPr>
-              <w:t>↑ / W</w:t>
-            </w:r>
-          </w:p>
-        </w:tc>
-        <w:tc>
-          <w:tcPr>
-            <w:tcW w:type="dxa" w:w="4703"/>
-          </w:tcPr>
-          <w:p>
-            <w:pPr>
-              <w:spacing w:before="40" w:after="40"/>
-            </w:pPr>
-            <w:r/>
-            <w:r>
-              <w:rPr>
-                <w:rFonts w:ascii="Iowan Old Style" w:hAnsi="Iowan Old Style"/>
-                <w:sz w:val="20"/>
-              </w:rPr>
-              <w:t>spiralin içine doğru zamanda ileri yürü</w:t>
-            </w:r>
-          </w:p>
-        </w:tc>
-      </w:tr>
-      <w:tr>
-        <w:tc>
-          <w:tcPr>
-            <w:tcW w:type="dxa" w:w="4703"/>
-          </w:tcPr>
-          <w:p>
-            <w:pPr>
-              <w:spacing w:before="40" w:after="40"/>
-            </w:pPr>
-            <w:r/>
-            <w:r>
-              <w:rPr>
-                <w:rFonts w:ascii="Iowan Old Style" w:hAnsi="Iowan Old Style"/>
-                <w:sz w:val="20"/>
-              </w:rPr>
-              <w:t>↓ / S</w:t>
-            </w:r>
-          </w:p>
-        </w:tc>
-        <w:tc>
-          <w:tcPr>
-            <w:tcW w:type="dxa" w:w="4703"/>
-          </w:tcPr>
-          <w:p>
-            <w:pPr>
-              <w:spacing w:before="40" w:after="40"/>
-            </w:pPr>
-            <w:r/>
-            <w:r>
-              <w:rPr>
-                <w:rFonts w:ascii="Iowan Old Style" w:hAnsi="Iowan Old Style"/>
-                <w:sz w:val="20"/>
-              </w:rPr>
-              <w:t>geriye doğru yürü</w:t>
-            </w:r>
-          </w:p>
-        </w:tc>
-      </w:tr>
-      <w:tr>
-        <w:tc>
-          <w:tcPr>
-            <w:tcW w:type="dxa" w:w="4703"/>
-          </w:tcPr>
-          <w:p>
-            <w:pPr>
-              <w:spacing w:before="40" w:after="40"/>
-            </w:pPr>
-            <w:r/>
-            <w:r>
-              <w:rPr>
-                <w:rFonts w:ascii="Iowan Old Style" w:hAnsi="Iowan Old Style"/>
-                <w:sz w:val="20"/>
-              </w:rPr>
-              <w:t>← → / A D</w:t>
-            </w:r>
-          </w:p>
-        </w:tc>
-        <w:tc>
-          <w:tcPr>
-            <w:tcW w:type="dxa" w:w="4703"/>
-          </w:tcPr>
-          <w:p>
-            <w:pPr>
-              <w:spacing w:before="40" w:after="40"/>
-            </w:pPr>
-            <w:r/>
-            <w:r>
-              <w:rPr>
-                <w:rFonts w:ascii="Iowan Old Style" w:hAnsi="Iowan Old Style"/>
-                <w:sz w:val="20"/>
-              </w:rPr>
-              <w:t>yana göz at</w:t>
-            </w:r>
-          </w:p>
-        </w:tc>
-      </w:tr>
-      <w:tr>
-        <w:tc>
-          <w:tcPr>
-            <w:tcW w:type="dxa" w:w="4703"/>
-          </w:tcPr>
-          <w:p>
-            <w:pPr>
-              <w:spacing w:before="40" w:after="40"/>
-            </w:pPr>
-            <w:r/>
-            <w:r>
-              <w:rPr>
-                <w:rFonts w:ascii="Iowan Old Style" w:hAnsi="Iowan Old Style"/>
-                <w:sz w:val="20"/>
-              </w:rPr>
-              <w:t>J</w:t>
-            </w:r>
-          </w:p>
-        </w:tc>
-        <w:tc>
-          <w:tcPr>
-            <w:tcW w:type="dxa" w:w="4703"/>
-          </w:tcPr>
-          <w:p>
-            <w:pPr>
-              <w:spacing w:before="40" w:after="40"/>
-            </w:pPr>
-            <w:r/>
-            <w:r>
-              <w:rPr>
-                <w:rFonts w:ascii="Iowan Old Style" w:hAnsi="Iowan Old Style"/>
-                <w:sz w:val="20"/>
-              </w:rPr>
-              <w:t>tarih seçici aç, doğrudan o güne atla</w:t>
-            </w:r>
-          </w:p>
-        </w:tc>
-      </w:tr>
-      <w:tr>
-        <w:tc>
-          <w:tcPr>
-            <w:tcW w:type="dxa" w:w="4703"/>
-          </w:tcPr>
-          <w:p>
-            <w:pPr>
-              <w:spacing w:before="40" w:after="40"/>
-            </w:pPr>
-            <w:r/>
-            <w:r>
-              <w:rPr>
-                <w:rFonts w:ascii="Iowan Old Style" w:hAnsi="Iowan Old Style"/>
-                <w:sz w:val="20"/>
-              </w:rPr>
-              <w:t>P</w:t>
-            </w:r>
-          </w:p>
-        </w:tc>
-        <w:tc>
-          <w:tcPr>
-            <w:tcW w:type="dxa" w:w="4703"/>
-          </w:tcPr>
-          <w:p>
-            <w:pPr>
-              <w:spacing w:before="40" w:after="40"/>
-            </w:pPr>
-            <w:r/>
-            <w:r>
-              <w:rPr>
-                <w:rFonts w:ascii="Iowan Old Style" w:hAnsi="Iowan Old Style"/>
-                <w:sz w:val="20"/>
-              </w:rPr>
-              <w:t>bulunduğun günün şarkısını nakarat'tan çal</w:t>
-            </w:r>
-          </w:p>
-        </w:tc>
-      </w:tr>
-      <w:tr>
-        <w:tc>
-          <w:tcPr>
-            <w:tcW w:type="dxa" w:w="4703"/>
-          </w:tcPr>
-          <w:p>
-            <w:pPr>
-              <w:spacing w:before="40" w:after="40"/>
-            </w:pPr>
-            <w:r/>
-            <w:r>
-              <w:rPr>
-                <w:rFonts w:ascii="Iowan Old Style" w:hAnsi="Iowan Old Style"/>
-                <w:sz w:val="20"/>
-              </w:rPr>
-              <w:t>Shift + P</w:t>
-            </w:r>
-          </w:p>
-        </w:tc>
-        <w:tc>
-          <w:tcPr>
-            <w:tcW w:type="dxa" w:w="4703"/>
-          </w:tcPr>
-          <w:p>
-            <w:pPr>
-              <w:spacing w:before="40" w:after="40"/>
-            </w:pPr>
-            <w:r/>
-            <w:r>
-              <w:rPr>
-                <w:rFonts w:ascii="Iowan Old Style" w:hAnsi="Iowan Old Style"/>
-                <w:sz w:val="20"/>
-              </w:rPr>
-              <w:t>şarkıyı en baştan çal</w:t>
+              <w:t>Nocturnal listening</w:t>
             </w:r>
           </w:p>
         </w:tc>
@@ -1242,30 +769,475 @@
         <w:rPr>
           <w:rFonts w:ascii="Iowan Old Style" w:hAnsi="Iowan Old Style"/>
           <w:color w:val="14101A"/>
-          <w:sz w:val="32"/>
+          <w:sz w:val="26"/>
         </w:rPr>
-        <w:t>Kaynak Kod</w:t>
+        <w:t>Decision notes</w:t>
       </w:r>
     </w:p>
     <w:p>
       <w:pPr>
-        <w:spacing w:after="120"/>
+        <w:pStyle w:val="ListBullet"/>
+        <w:spacing w:after="40"/>
       </w:pPr>
       <w:r>
         <w:rPr>
           <w:rFonts w:ascii="Iowan Old Style" w:hAnsi="Iowan Old Style"/>
-          <w:sz w:val="22"/>
+          <w:sz w:val="20"/>
         </w:rPr>
-        <w:t>Tüm pipeline kodu, mock üretim scriptleri, palette ajan çıktıları ve görsel katman public bir GitHub repository'sinde yayınlanır. Veri katmanı `data/processed/` altında CSV ve JSON olarak; sanat katmanı `art/` altında Vite tabanlı bir React + Three.js uygulaması olarak yer alır.</w:t>
+        <w:t>Album signature colour. Not the cover's dominant pixel — the colour a fan associates with the album. 134 unique albums; signatures picked by 5 parallel AI agents inspecting cover art + music knowledge (RAM → metallic gold, OK Computer → ice-blue, The Strokes' New Abnormal → magenta).</w:t>
       </w:r>
     </w:p>
     <w:p>
+      <w:pPr>
+        <w:pStyle w:val="ListBullet"/>
+        <w:spacing w:after="40"/>
+      </w:pPr>
+      <w:r>
+        <w:rPr>
+          <w:rFonts w:ascii="Iowan Old Style" w:hAnsi="Iowan Old Style"/>
+          <w:sz w:val="20"/>
+        </w:rPr>
+        <w:t>Weather colour map. Literal: hot sunny → amber, cool sunny → sky-blue, overcast → grey-blue, rainy → grey, heavy rain → near-black, snow → ice-blue. All transitions RGB-lerped so hues never pass through green.</w:t>
+      </w:r>
+    </w:p>
+    <w:p>
+      <w:pPr>
+        <w:pStyle w:val="ListBullet"/>
+        <w:spacing w:after="40"/>
+      </w:pPr>
+      <w:r>
+        <w:rPr>
+          <w:rFonts w:ascii="Iowan Old Style" w:hAnsi="Iowan Old Style"/>
+          <w:sz w:val="20"/>
+        </w:rPr>
+        <w:t>Screen-time mapping. The dominant driver. Drives geometry (corridor width 1.24 m → 3.20 m, wall height 2.8 m → 4.9 m), brightness (up to −44% on peak days), and motion (±32% jitter + occasional black-out bursts). Quiet days the wall breathes; heavy days it darkens and twitches.</w:t>
+      </w:r>
+    </w:p>
+    <w:p>
+      <w:pPr>
+        <w:pStyle w:val="ListBullet"/>
+        <w:spacing w:after="40"/>
+      </w:pPr>
+      <w:r>
+        <w:rPr>
+          <w:rFonts w:ascii="Iowan Old Style" w:hAnsi="Iowan Old Style"/>
+          <w:sz w:val="20"/>
+        </w:rPr>
+        <w:t>Step mapping. Floor-only effect. Active days pool light beneath you in the album's colour; sedentary days leave the floor near-black. A ±10% width modifier reinforces the bodily reading without competing with screen time.</w:t>
+      </w:r>
+    </w:p>
+    <w:p>
+      <w:pPr>
+        <w:pStyle w:val="ListBullet"/>
+        <w:spacing w:after="40"/>
+      </w:pPr>
+      <w:r>
+        <w:rPr>
+          <w:rFonts w:ascii="Iowan Old Style" w:hAnsi="Iowan Old Style"/>
+          <w:sz w:val="20"/>
+        </w:rPr>
+        <w:t>Mock screen time. Only because iOS Screen Time didn't track the earlier 7.5 months. Shape follows the lived arc — high Aug–Dec (project crunch), valley Dec–Feb (winter break), rising ramp Feb–Apr. Deterministic, seeded, reproducible.</w:t>
+      </w:r>
+    </w:p>
+    <w:p>
+      <w:pPr>
+        <w:pStyle w:val="Heading1"/>
+      </w:pPr>
+      <w:r>
+        <w:rPr>
+          <w:rFonts w:ascii="Iowan Old Style" w:hAnsi="Iowan Old Style"/>
+          <w:color w:val="14101A"/>
+          <w:sz w:val="26"/>
+        </w:rPr>
+        <w:t>Structure and mechanics</w:t>
+      </w:r>
+    </w:p>
+    <w:p>
+      <w:pPr>
+        <w:pStyle w:val="ListBullet"/>
+        <w:spacing w:after="40"/>
+      </w:pPr>
+      <w:r>
+        <w:rPr>
+          <w:rFonts w:ascii="Iowan Old Style" w:hAnsi="Iowan Old Style"/>
+          <w:sz w:val="20"/>
+        </w:rPr>
+        <w:t>Archimedean spiral: 5 turns, outer radius 18 m, inner radius 2.5 m, 0.18 m organic wobble for fingerprint-like irregularity.</w:t>
+      </w:r>
+    </w:p>
+    <w:p>
+      <w:pPr>
+        <w:pStyle w:val="ListBullet"/>
+        <w:spacing w:after="40"/>
+      </w:pPr>
+      <w:r>
+        <w:rPr>
+          <w:rFonts w:ascii="Iowan Old Style" w:hAnsi="Iowan Old Style"/>
+          <w:sz w:val="20"/>
+        </w:rPr>
+        <w:t>Two walls (2 m corridor base width), floor, ceiling. Per-day vertex attributes feed all visual layers.</w:t>
+      </w:r>
+    </w:p>
+    <w:p>
+      <w:pPr>
+        <w:pStyle w:val="ListBullet"/>
+        <w:spacing w:after="40"/>
+      </w:pPr>
+      <w:r>
+        <w:rPr>
+          <w:rFonts w:ascii="Iowan Old Style" w:hAnsi="Iowan Old Style"/>
+          <w:sz w:val="20"/>
+        </w:rPr>
+        <w:t>Walk camera at 1.62 m eye height; orbit camera for sculptural view. V key toggles.</w:t>
+      </w:r>
+    </w:p>
+    <w:p>
+      <w:pPr>
+        <w:pStyle w:val="ListBullet"/>
+        <w:spacing w:after="40"/>
+      </w:pPr>
+      <w:r>
+        <w:rPr>
+          <w:rFonts w:ascii="Iowan Old Style" w:hAnsi="Iowan Old Style"/>
+          <w:sz w:val="20"/>
+        </w:rPr>
+        <w:t>Stack: React 18 + react-three-fiber + Three.js + Vite. Custom GLSL shaders for the wall layers.</w:t>
+      </w:r>
+    </w:p>
+    <w:p>
+      <w:pPr>
+        <w:pStyle w:val="ListBullet"/>
+        <w:spacing w:after="40"/>
+      </w:pPr>
+      <w:r>
+        <w:rPr>
+          <w:rFonts w:ascii="Iowan Old Style" w:hAnsi="Iowan Old Style"/>
+          <w:sz w:val="20"/>
+        </w:rPr>
+        <w:t>Audio: Spotify Web Playback SDK (PKCE flow). The current day's top track is searched, then started at its loudest section via audio-analysis (defaults to chorus).</w:t>
+      </w:r>
+    </w:p>
+    <w:p>
+      <w:pPr>
+        <w:pStyle w:val="Heading2"/>
+      </w:pPr>
+      <w:r>
+        <w:rPr>
+          <w:rFonts w:ascii="Iowan Old Style" w:hAnsi="Iowan Old Style"/>
+          <w:color w:val="14101A"/>
+          <w:sz w:val="22"/>
+        </w:rPr>
+        <w:t>Controls</w:t>
+      </w:r>
+    </w:p>
+    <w:tbl>
+      <w:tblPr>
+        <w:tblStyle w:val="LightGrid-Accent1"/>
+        <w:tblW w:type="auto" w:w="0"/>
+        <w:jc w:val="left"/>
+        <w:tblLook w:firstColumn="1" w:firstRow="1" w:lastColumn="0" w:lastRow="0" w:noHBand="0" w:noVBand="1" w:val="04A0"/>
+      </w:tblPr>
+      <w:tblGrid>
+        <w:gridCol w:w="4873"/>
+        <w:gridCol w:w="4873"/>
+      </w:tblGrid>
+      <w:tr>
+        <w:tc>
+          <w:tcPr>
+            <w:tcW w:type="dxa" w:w="1984"/>
+            <w:shd w:val="clear" w:color="auto" w:fill="1A1020"/>
+          </w:tcPr>
+          <w:p>
+            <w:pPr>
+              <w:spacing w:before="40" w:after="40"/>
+            </w:pPr>
+            <w:r/>
+            <w:r>
+              <w:rPr>
+                <w:rFonts w:ascii="Iowan Old Style" w:hAnsi="Iowan Old Style"/>
+                <w:b/>
+                <w:color w:val="F5E9D8"/>
+                <w:sz w:val="17"/>
+              </w:rPr>
+              <w:t>KEY</w:t>
+            </w:r>
+          </w:p>
+        </w:tc>
+        <w:tc>
+          <w:tcPr>
+            <w:tcW w:type="dxa" w:w="6803"/>
+            <w:shd w:val="clear" w:color="auto" w:fill="1A1020"/>
+          </w:tcPr>
+          <w:p>
+            <w:pPr>
+              <w:spacing w:before="40" w:after="40"/>
+            </w:pPr>
+            <w:r/>
+            <w:r>
+              <w:rPr>
+                <w:rFonts w:ascii="Iowan Old Style" w:hAnsi="Iowan Old Style"/>
+                <w:b/>
+                <w:color w:val="F5E9D8"/>
+                <w:sz w:val="17"/>
+              </w:rPr>
+              <w:t>ACTION</w:t>
+            </w:r>
+          </w:p>
+        </w:tc>
+      </w:tr>
+      <w:tr>
+        <w:tc>
+          <w:tcPr>
+            <w:tcW w:type="dxa" w:w="1984"/>
+          </w:tcPr>
+          <w:p>
+            <w:pPr>
+              <w:spacing w:before="40" w:after="40"/>
+            </w:pPr>
+            <w:r/>
+            <w:r>
+              <w:rPr>
+                <w:rFonts w:ascii="Iowan Old Style" w:hAnsi="Iowan Old Style"/>
+                <w:sz w:val="18"/>
+              </w:rPr>
+              <w:t>V</w:t>
+            </w:r>
+          </w:p>
+        </w:tc>
+        <w:tc>
+          <w:tcPr>
+            <w:tcW w:type="dxa" w:w="6803"/>
+          </w:tcPr>
+          <w:p>
+            <w:pPr>
+              <w:spacing w:before="40" w:after="40"/>
+            </w:pPr>
+            <w:r/>
+            <w:r>
+              <w:rPr>
+                <w:rFonts w:ascii="Iowan Old Style" w:hAnsi="Iowan Old Style"/>
+                <w:sz w:val="18"/>
+              </w:rPr>
+              <w:t>toggle orbit / walk</w:t>
+            </w:r>
+          </w:p>
+        </w:tc>
+      </w:tr>
+      <w:tr>
+        <w:tc>
+          <w:tcPr>
+            <w:tcW w:type="dxa" w:w="1984"/>
+          </w:tcPr>
+          <w:p>
+            <w:pPr>
+              <w:spacing w:before="40" w:after="40"/>
+            </w:pPr>
+            <w:r/>
+            <w:r>
+              <w:rPr>
+                <w:rFonts w:ascii="Iowan Old Style" w:hAnsi="Iowan Old Style"/>
+                <w:sz w:val="18"/>
+              </w:rPr>
+              <w:t>↑ ↓  /  W  S</w:t>
+            </w:r>
+          </w:p>
+        </w:tc>
+        <w:tc>
+          <w:tcPr>
+            <w:tcW w:type="dxa" w:w="6803"/>
+          </w:tcPr>
+          <w:p>
+            <w:pPr>
+              <w:spacing w:before="40" w:after="40"/>
+            </w:pPr>
+            <w:r/>
+            <w:r>
+              <w:rPr>
+                <w:rFonts w:ascii="Iowan Old Style" w:hAnsi="Iowan Old Style"/>
+                <w:sz w:val="18"/>
+              </w:rPr>
+              <w:t>walk forward / back along time</w:t>
+            </w:r>
+          </w:p>
+        </w:tc>
+      </w:tr>
+      <w:tr>
+        <w:tc>
+          <w:tcPr>
+            <w:tcW w:type="dxa" w:w="1984"/>
+          </w:tcPr>
+          <w:p>
+            <w:pPr>
+              <w:spacing w:before="40" w:after="40"/>
+            </w:pPr>
+            <w:r/>
+            <w:r>
+              <w:rPr>
+                <w:rFonts w:ascii="Iowan Old Style" w:hAnsi="Iowan Old Style"/>
+                <w:sz w:val="18"/>
+              </w:rPr>
+              <w:t>← →  /  A  D</w:t>
+            </w:r>
+          </w:p>
+        </w:tc>
+        <w:tc>
+          <w:tcPr>
+            <w:tcW w:type="dxa" w:w="6803"/>
+          </w:tcPr>
+          <w:p>
+            <w:pPr>
+              <w:spacing w:before="40" w:after="40"/>
+            </w:pPr>
+            <w:r/>
+            <w:r>
+              <w:rPr>
+                <w:rFonts w:ascii="Iowan Old Style" w:hAnsi="Iowan Old Style"/>
+                <w:sz w:val="18"/>
+              </w:rPr>
+              <w:t>glance sideways</w:t>
+            </w:r>
+          </w:p>
+        </w:tc>
+      </w:tr>
+      <w:tr>
+        <w:tc>
+          <w:tcPr>
+            <w:tcW w:type="dxa" w:w="1984"/>
+          </w:tcPr>
+          <w:p>
+            <w:pPr>
+              <w:spacing w:before="40" w:after="40"/>
+            </w:pPr>
+            <w:r/>
+            <w:r>
+              <w:rPr>
+                <w:rFonts w:ascii="Iowan Old Style" w:hAnsi="Iowan Old Style"/>
+                <w:sz w:val="18"/>
+              </w:rPr>
+              <w:t>J</w:t>
+            </w:r>
+          </w:p>
+        </w:tc>
+        <w:tc>
+          <w:tcPr>
+            <w:tcW w:type="dxa" w:w="6803"/>
+          </w:tcPr>
+          <w:p>
+            <w:pPr>
+              <w:spacing w:before="40" w:after="40"/>
+            </w:pPr>
+            <w:r/>
+            <w:r>
+              <w:rPr>
+                <w:rFonts w:ascii="Iowan Old Style" w:hAnsi="Iowan Old Style"/>
+                <w:sz w:val="18"/>
+              </w:rPr>
+              <w:t>jump to a specific date</w:t>
+            </w:r>
+          </w:p>
+        </w:tc>
+      </w:tr>
+      <w:tr>
+        <w:tc>
+          <w:tcPr>
+            <w:tcW w:type="dxa" w:w="1984"/>
+          </w:tcPr>
+          <w:p>
+            <w:pPr>
+              <w:spacing w:before="40" w:after="40"/>
+            </w:pPr>
+            <w:r/>
+            <w:r>
+              <w:rPr>
+                <w:rFonts w:ascii="Iowan Old Style" w:hAnsi="Iowan Old Style"/>
+                <w:sz w:val="18"/>
+              </w:rPr>
+              <w:t>P</w:t>
+            </w:r>
+          </w:p>
+        </w:tc>
+        <w:tc>
+          <w:tcPr>
+            <w:tcW w:type="dxa" w:w="6803"/>
+          </w:tcPr>
+          <w:p>
+            <w:pPr>
+              <w:spacing w:before="40" w:after="40"/>
+            </w:pPr>
+            <w:r/>
+            <w:r>
+              <w:rPr>
+                <w:rFonts w:ascii="Iowan Old Style" w:hAnsi="Iowan Old Style"/>
+                <w:sz w:val="18"/>
+              </w:rPr>
+              <w:t>play current day's song from chorus</w:t>
+            </w:r>
+          </w:p>
+        </w:tc>
+      </w:tr>
+      <w:tr>
+        <w:tc>
+          <w:tcPr>
+            <w:tcW w:type="dxa" w:w="1984"/>
+          </w:tcPr>
+          <w:p>
+            <w:pPr>
+              <w:spacing w:before="40" w:after="40"/>
+            </w:pPr>
+            <w:r/>
+            <w:r>
+              <w:rPr>
+                <w:rFonts w:ascii="Iowan Old Style" w:hAnsi="Iowan Old Style"/>
+                <w:sz w:val="18"/>
+              </w:rPr>
+              <w:t>Shift + P</w:t>
+            </w:r>
+          </w:p>
+        </w:tc>
+        <w:tc>
+          <w:tcPr>
+            <w:tcW w:type="dxa" w:w="6803"/>
+          </w:tcPr>
+          <w:p>
+            <w:pPr>
+              <w:spacing w:before="40" w:after="40"/>
+            </w:pPr>
+            <w:r/>
+            <w:r>
+              <w:rPr>
+                <w:rFonts w:ascii="Iowan Old Style" w:hAnsi="Iowan Old Style"/>
+                <w:sz w:val="18"/>
+              </w:rPr>
+              <w:t>play from the start</w:t>
+            </w:r>
+          </w:p>
+        </w:tc>
+      </w:tr>
+    </w:tbl>
+    <w:p>
+      <w:pPr>
+        <w:pStyle w:val="Heading1"/>
+      </w:pPr>
+      <w:r>
+        <w:rPr>
+          <w:rFonts w:ascii="Iowan Old Style" w:hAnsi="Iowan Old Style"/>
+          <w:color w:val="14101A"/>
+          <w:sz w:val="26"/>
+        </w:rPr>
+        <w:t>Repository</w:t>
+      </w:r>
+    </w:p>
+    <w:p>
+      <w:pPr>
+        <w:spacing w:after="80"/>
+      </w:pPr>
       <w:hyperlink r:id="rId9">
         <w:r>
           <w:rPr>
             <w:color w:val="3A4FB8"/>
             <w:u w:val="single"/>
             <w:rFonts w:ascii="Iowan Old Style"/>
+            <w:sz w:val="21"/>
           </w:rPr>
           <w:t>https://github.com/seymakucuk0/innerprint-an-data-art-project</w:t>
         </w:r>
@@ -1273,107 +1245,72 @@
     </w:p>
     <w:p>
       <w:pPr>
-        <w:spacing w:after="120"/>
-      </w:pPr>
-      <w:r>
-        <w:rPr>
-          <w:rFonts w:ascii="Iowan Old Style" w:hAnsi="Iowan Old Style"/>
-          <w:sz w:val="22"/>
-        </w:rPr>
-      </w:r>
-    </w:p>
-    <w:p>
-      <w:pPr>
-        <w:spacing w:after="120"/>
-      </w:pPr>
-      <w:r>
-        <w:rPr>
-          <w:rFonts w:ascii="Iowan Old Style" w:hAnsi="Iowan Old Style"/>
-          <w:sz w:val="22"/>
-        </w:rPr>
-        <w:t>Repository içeriği aşağıdaki bölümlere ayrılır:</w:t>
-      </w:r>
-    </w:p>
-    <w:p>
-      <w:pPr>
         <w:pStyle w:val="ListBullet"/>
+        <w:spacing w:after="40"/>
       </w:pPr>
       <w:r>
         <w:rPr>
           <w:rFonts w:ascii="Iowan Old Style" w:hAnsi="Iowan Old Style"/>
           <w:sz w:val="20"/>
         </w:rPr>
-        <w:t>data/processed/ — günlük birleşik tablo (innerprint_daily.csv / .json), kaynak CSV'ler, signature palet</w:t>
+        <w:t>data/processed/ — daily joined table (innerprint_daily.csv / .json), per-source CSVs, album signature palette</w:t>
       </w:r>
     </w:p>
     <w:p>
       <w:pPr>
         <w:pStyle w:val="ListBullet"/>
+        <w:spacing w:after="40"/>
       </w:pPr>
       <w:r>
         <w:rPr>
           <w:rFonts w:ascii="Iowan Old Style" w:hAnsi="Iowan Old Style"/>
           <w:sz w:val="20"/>
         </w:rPr>
-        <w:t>data/agent_batches/ — 5 paralel AI ajanın albüm signature renklerini seçtiği batch input ve çıktıları</w:t>
+        <w:t>data/agent_batches/ — AI agent inputs and outputs for the album signature colour pass</w:t>
       </w:r>
     </w:p>
     <w:p>
       <w:pPr>
         <w:pStyle w:val="ListBullet"/>
+        <w:spacing w:after="40"/>
       </w:pPr>
       <w:r>
         <w:rPr>
           <w:rFonts w:ascii="Iowan Old Style" w:hAnsi="Iowan Old Style"/>
           <w:sz w:val="20"/>
         </w:rPr>
-        <w:t>scripts/ — backfill_weather.py, generate_screentime.py, top_song_per_day.py, merge_innerprint.py, build_manifesto_docx.py</w:t>
+        <w:t>scripts/ — weather backfill, screen-time mock, top-song aggregation, merge, this manifesto generator</w:t>
       </w:r>
     </w:p>
     <w:p>
       <w:pPr>
         <w:pStyle w:val="ListBullet"/>
+        <w:spacing w:after="40"/>
       </w:pPr>
       <w:r>
         <w:rPr>
           <w:rFonts w:ascii="Iowan Old Style" w:hAnsi="Iowan Old Style"/>
           <w:sz w:val="20"/>
         </w:rPr>
-        <w:t>art/ — Vite + React + Three.js prototip (canlı izlenebilir uygulama)</w:t>
+        <w:t>art/ — Vite + React + Three.js application</w:t>
       </w:r>
     </w:p>
     <w:p>
       <w:pPr>
         <w:pStyle w:val="ListBullet"/>
+        <w:spacing w:after="40"/>
       </w:pPr>
       <w:r>
         <w:rPr>
           <w:rFonts w:ascii="Iowan Old Style" w:hAnsi="Iowan Old Style"/>
           <w:sz w:val="20"/>
         </w:rPr>
-        <w:t>.github/workflows/deploy.yml — GitHub Pages üzerinde otomatik dağıtım</w:t>
-      </w:r>
-    </w:p>
-    <w:p/>
-    <w:p>
-      <w:pPr>
-        <w:jc w:val="center"/>
-      </w:pPr>
-      <w:r>
-        <w:rPr>
-          <w:rFonts w:ascii="Iowan Old Style" w:hAnsi="Iowan Old Style"/>
-          <w:i/>
-          <w:color w:val="3A2240"/>
-          <w:sz w:val="22"/>
-        </w:rPr>
-        <w:t>the spiral remembers what the body did,</w:t>
-        <w:br/>
-        <w:t>what the ears heard, what the sky said.</w:t>
+        <w:t>.github/workflows/deploy.yml — GitHub Pages auto-deploy</w:t>
       </w:r>
     </w:p>
     <w:sectPr>
       <w:pgSz w:w="12240" w:h="15840"/>
-      <w:pgMar w:top="1134" w:right="1417" w:bottom="1134" w:left="1417" w:header="720" w:footer="720" w:gutter="0"/>
+      <w:pgMar w:top="1020" w:right="1247" w:bottom="1020" w:left="1247" w:header="720" w:footer="720" w:gutter="0"/>
       <w:cols w:space="720"/>
       <w:docGrid w:linePitch="360"/>
     </w:sectPr>

</xml_diff>